<commit_message>
Added API and random word
</commit_message>
<xml_diff>
--- a/Assignment 4/assignment 4-wordle-2.docx
+++ b/Assignment 4/assignment 4-wordle-2.docx
@@ -300,8 +300,13 @@
       </w:r>
     </w:p>
     <w:p>
+      <w:proofErr w:type="gramStart"/>
       <w:r>
-        <w:t xml:space="preserve">API’s must return JSON and must </w:t>
+        <w:t>API’s</w:t>
+      </w:r>
+      <w:proofErr w:type="gramEnd"/>
+      <w:r>
+        <w:t xml:space="preserve"> must return JSON and must </w:t>
       </w:r>
       <w:r>
         <w:t>be accessed using</w:t>
@@ -463,14 +468,46 @@
           <w:i/>
           <w:iCs/>
         </w:rPr>
-        <w:t xml:space="preserve"> a model of how your implementation should appear.  You are welcome to add enhancements as long as you meet the requirements.</w:t>
+        <w:t xml:space="preserve"> a model of how your implementation should appear.  You are welcome to add enhancements </w:t>
+      </w:r>
+      <w:proofErr w:type="gramStart"/>
+      <w:r>
+        <w:rPr>
+          <w:i/>
+          <w:iCs/>
+        </w:rPr>
+        <w:t>as long as</w:t>
+      </w:r>
+      <w:proofErr w:type="gramEnd"/>
+      <w:r>
+        <w:rPr>
+          <w:i/>
+          <w:iCs/>
+        </w:rPr>
+        <w:t xml:space="preserve"> you meet the requirements.</w:t>
       </w:r>
       <w:r>
         <w:rPr>
           <w:i/>
           <w:iCs/>
         </w:rPr>
-        <w:t xml:space="preserve">  Note:  Use an input box to enter the guess – this deviates from the NY Times version.</w:t>
+        <w:t xml:space="preserve">  Note:  Use an input box to enter the guess – </w:t>
+      </w:r>
+      <w:proofErr w:type="gramStart"/>
+      <w:r>
+        <w:rPr>
+          <w:i/>
+          <w:iCs/>
+        </w:rPr>
+        <w:t>this deviates</w:t>
+      </w:r>
+      <w:proofErr w:type="gramEnd"/>
+      <w:r>
+        <w:rPr>
+          <w:i/>
+          <w:iCs/>
+        </w:rPr>
+        <w:t xml:space="preserve"> from the NY Times version.</w:t>
       </w:r>
     </w:p>
     <w:p>
@@ -687,7 +724,15 @@
     </w:p>
     <w:p>
       <w:r>
-        <w:t>The player has 6 tries to guess a 5 letter word.</w:t>
+        <w:t xml:space="preserve">The player has 6 tries to guess a </w:t>
+      </w:r>
+      <w:proofErr w:type="gramStart"/>
+      <w:r>
+        <w:t>5 letter</w:t>
+      </w:r>
+      <w:proofErr w:type="gramEnd"/>
+      <w:r>
+        <w:t xml:space="preserve"> word.</w:t>
       </w:r>
     </w:p>
     <w:p>
@@ -834,9 +879,11 @@
       <w:r>
         <w:t>“</w:t>
       </w:r>
+      <w:proofErr w:type="gramStart"/>
       <w:r>
         <w:t>create</w:t>
       </w:r>
+      <w:proofErr w:type="gramEnd"/>
       <w:r>
         <w:t>”</w:t>
       </w:r>
@@ -1270,6 +1317,7 @@
           <w:b w:val="0"/>
           <w:bCs w:val="0"/>
           <w:color w:val="404040" w:themeColor="text1" w:themeTint="BF"/>
+          <w:lang w:val="sv-SE"/>
         </w:rPr>
       </w:pPr>
       <w:r>
@@ -1278,8 +1326,9 @@
           <w:b w:val="0"/>
           <w:bCs w:val="0"/>
           <w:color w:val="404040" w:themeColor="text1" w:themeTint="BF"/>
+          <w:lang w:val="sv-SE"/>
         </w:rPr>
-        <w:t xml:space="preserve">URL </w:t>
+        <w:t>URL</w:t>
       </w:r>
       <w:r>
         <w:rPr>
@@ -1287,14 +1336,65 @@
           <w:b w:val="0"/>
           <w:bCs w:val="0"/>
           <w:color w:val="404040" w:themeColor="text1" w:themeTint="BF"/>
+          <w:lang w:val="sv-SE"/>
         </w:rPr>
-        <w:t>____________________________</w:t>
+        <w:t xml:space="preserve">: </w:t>
+      </w:r>
+      <w:r>
+        <w:fldChar w:fldCharType="begin"/>
+      </w:r>
+      <w:r>
+        <w:rPr>
+          <w:lang w:val="sv-SE"/>
+        </w:rPr>
+        <w:instrText>HYPERLINK "https://pochat.github.io/harvard-dgmd-e-28/Assignment%204/index.html"</w:instrText>
+      </w:r>
+      <w:r>
+        <w:fldChar w:fldCharType="separate"/>
+      </w:r>
+      <w:r>
+        <w:rPr>
+          <w:rStyle w:val="Hyperlink"/>
+          <w:rFonts w:asciiTheme="minorHAnsi" w:eastAsiaTheme="minorHAnsi" w:hAnsiTheme="minorHAnsi" w:cstheme="minorBidi"/>
+          <w:b w:val="0"/>
+          <w:bCs w:val="0"/>
+          <w:lang w:val="sv-SE"/>
+        </w:rPr>
+        <w:t>https://pochat.github.io/harvard-dgmd-e-28/Assignment%204/index.html</w:t>
+      </w:r>
+      <w:r>
+        <w:fldChar w:fldCharType="end"/>
       </w:r>
     </w:p>
     <w:p>
       <w:r>
+        <w:rPr>
+          <w:lang w:val="sv-SE"/>
+        </w:rPr>
         <w:br/>
-        <w:t xml:space="preserve">[  ] </w:t>
+      </w:r>
+      <w:r>
+        <w:t xml:space="preserve">[ </w:t>
+      </w:r>
+      <w:r>
+        <w:rPr>
+          <w:rFonts w:ascii="Apple Color Emoji" w:hAnsi="Apple Color Emoji"/>
+        </w:rPr>
+        <w:t>✔</w:t>
+      </w:r>
+      <w:proofErr w:type="gramStart"/>
+      <w:r>
+        <w:rPr>
+          <w:rFonts w:ascii="Apple Color Emoji" w:hAnsi="Apple Color Emoji"/>
+        </w:rPr>
+        <w:t>️</w:t>
+      </w:r>
+      <w:r>
+        <w:t xml:space="preserve"> ]</w:t>
+      </w:r>
+      <w:proofErr w:type="gramEnd"/>
+      <w:r>
+        <w:t xml:space="preserve"> </w:t>
       </w:r>
       <w:r>
         <w:t xml:space="preserve">All </w:t>
@@ -1309,9 +1409,65 @@
     <w:p/>
     <w:p>
       <w:r>
-        <w:t>Did you complete any extra features? __________________________________________</w:t>
+        <w:t xml:space="preserve">Did you complete any extra features? </w:t>
+      </w:r>
+      <w:r>
+        <w:t>Yes, I added the following extra features:</w:t>
       </w:r>
     </w:p>
+    <w:p>
+      <w:pPr>
+        <w:rPr>
+          <w:color w:val="0070C0"/>
+        </w:rPr>
+      </w:pPr>
+      <w:r>
+        <w:rPr>
+          <w:color w:val="0070C0"/>
+        </w:rPr>
+        <w:t>Input field is hidden until game starts to keep a clean UI</w:t>
+      </w:r>
+    </w:p>
+    <w:p>
+      <w:pPr>
+        <w:rPr>
+          <w:color w:val="0070C0"/>
+        </w:rPr>
+      </w:pPr>
+      <w:r>
+        <w:rPr>
+          <w:color w:val="0070C0"/>
+        </w:rPr>
+        <w:t>Input field only accepts alphabet letters, and not special characters or numbers</w:t>
+      </w:r>
+    </w:p>
+    <w:p>
+      <w:pPr>
+        <w:rPr>
+          <w:color w:val="0070C0"/>
+        </w:rPr>
+      </w:pPr>
+      <w:r>
+        <w:rPr>
+          <w:color w:val="0070C0"/>
+        </w:rPr>
+        <w:t>The submit button is disabled until the user enters five characters</w:t>
+      </w:r>
+    </w:p>
+    <w:p>
+      <w:pPr>
+        <w:rPr>
+          <w:color w:val="0070C0"/>
+        </w:rPr>
+      </w:pPr>
+      <w:r>
+        <w:rPr>
+          <w:color w:val="0070C0"/>
+        </w:rPr>
+        <w:t>A modal window for the user to know when they win or lose the game</w:t>
+      </w:r>
+    </w:p>
+    <w:p/>
     <w:p>
       <w:r>
         <w:t>Was there anything you could not get to work?  _________________________________</w:t>
@@ -1321,11 +1477,9 @@
       <w:r>
         <w:t xml:space="preserve">What was the API you used – and why (include the </w:t>
       </w:r>
-      <w:proofErr w:type="spellStart"/>
       <w:r>
-        <w:t>url</w:t>
+        <w:t>URL</w:t>
       </w:r>
-      <w:proofErr w:type="spellEnd"/>
       <w:r>
         <w:t xml:space="preserve"> to the source) ________________</w:t>
       </w:r>
@@ -1358,7 +1512,161 @@
         <w:t>?</w:t>
       </w:r>
     </w:p>
-    <w:p/>
+    <w:p>
+      <w:pPr>
+        <w:rPr>
+          <w:color w:val="0070C0"/>
+        </w:rPr>
+      </w:pPr>
+      <w:r>
+        <w:rPr>
+          <w:color w:val="0070C0"/>
+        </w:rPr>
+        <w:lastRenderedPageBreak/>
+        <w:t>The most satisfying part is that I</w:t>
+      </w:r>
+      <w:r>
+        <w:rPr>
+          <w:color w:val="0070C0"/>
+        </w:rPr>
+        <w:t xml:space="preserve"> am getting glimpses of producing the code of </w:t>
+      </w:r>
+      <w:r>
+        <w:rPr>
+          <w:color w:val="0070C0"/>
+        </w:rPr>
+        <w:t xml:space="preserve">what I want. For example, I think something </w:t>
+      </w:r>
+      <w:proofErr w:type="gramStart"/>
+      <w:r>
+        <w:rPr>
+          <w:color w:val="0070C0"/>
+        </w:rPr>
+        <w:t>like</w:t>
+      </w:r>
+      <w:r>
+        <w:rPr>
+          <w:color w:val="0070C0"/>
+        </w:rPr>
+        <w:t>:</w:t>
+      </w:r>
+      <w:proofErr w:type="gramEnd"/>
+      <w:r>
+        <w:rPr>
+          <w:color w:val="0070C0"/>
+        </w:rPr>
+        <w:t xml:space="preserve"> I will create a function that does this… and then I do it</w:t>
+      </w:r>
+      <w:r>
+        <w:rPr>
+          <w:color w:val="0070C0"/>
+        </w:rPr>
+        <w:t>,</w:t>
+      </w:r>
+      <w:r>
+        <w:rPr>
+          <w:color w:val="0070C0"/>
+        </w:rPr>
+        <w:t xml:space="preserve"> and it works</w:t>
+      </w:r>
+      <w:r>
+        <w:rPr>
+          <w:color w:val="0070C0"/>
+        </w:rPr>
+        <w:t>. Ha!</w:t>
+      </w:r>
+      <w:r>
+        <w:rPr>
+          <w:color w:val="0070C0"/>
+        </w:rPr>
+        <w:t xml:space="preserve"> While I still struggle to achieve what I want due to my limited programming</w:t>
+      </w:r>
+      <w:r>
+        <w:rPr>
+          <w:color w:val="0070C0"/>
+        </w:rPr>
+        <w:t xml:space="preserve"> knowledge</w:t>
+      </w:r>
+      <w:r>
+        <w:rPr>
+          <w:color w:val="0070C0"/>
+        </w:rPr>
+        <w:t xml:space="preserve">, I feel that </w:t>
+      </w:r>
+      <w:r>
+        <w:rPr>
+          <w:color w:val="0070C0"/>
+        </w:rPr>
+        <w:t>formulate</w:t>
+      </w:r>
+      <w:r>
+        <w:rPr>
+          <w:color w:val="0070C0"/>
+        </w:rPr>
+        <w:t xml:space="preserve"> lines of code, and start implementing them on my own. That feels </w:t>
+      </w:r>
+      <w:proofErr w:type="gramStart"/>
+      <w:r>
+        <w:rPr>
+          <w:color w:val="0070C0"/>
+        </w:rPr>
+        <w:t>really good</w:t>
+      </w:r>
+      <w:proofErr w:type="gramEnd"/>
+      <w:r>
+        <w:rPr>
+          <w:color w:val="0070C0"/>
+        </w:rPr>
+        <w:t>.</w:t>
+      </w:r>
+      <w:r>
+        <w:rPr>
+          <w:color w:val="0070C0"/>
+        </w:rPr>
+        <w:t xml:space="preserve"> Now when I get stuck, I continue thinking on the problem while having lunch, showering, etc. How would I do this in real life</w:t>
+      </w:r>
+      <w:r>
+        <w:rPr>
+          <w:color w:val="0070C0"/>
+        </w:rPr>
+        <w:t>?</w:t>
+      </w:r>
+      <w:r>
+        <w:rPr>
+          <w:color w:val="0070C0"/>
+        </w:rPr>
+        <w:t xml:space="preserve"> and then I start experimenting with the code</w:t>
+      </w:r>
+      <w:r>
+        <w:rPr>
+          <w:color w:val="0070C0"/>
+        </w:rPr>
+        <w:t xml:space="preserve"> until it works.</w:t>
+      </w:r>
+    </w:p>
+    <w:p>
+      <w:pPr>
+        <w:rPr>
+          <w:color w:val="0070C0"/>
+        </w:rPr>
+      </w:pPr>
+      <w:r>
+        <w:rPr>
+          <w:color w:val="0070C0"/>
+        </w:rPr>
+        <w:t>On a similar note, I still don’t understand when to add a return inside a function, as functions seem to work well without returns. I’m still learning this part.</w:t>
+      </w:r>
+    </w:p>
+    <w:p>
+      <w:pPr>
+        <w:tabs>
+          <w:tab w:val="left" w:pos="5574"/>
+        </w:tabs>
+      </w:pPr>
+      <w:r>
+        <w:tab/>
+      </w:r>
+    </w:p>
     <w:sectPr>
       <w:footerReference w:type="default" r:id="rId10"/>
       <w:pgSz w:w="12240" w:h="15840" w:code="1"/>

</xml_diff>

<commit_message>
Worldle redux first commit
</commit_message>
<xml_diff>
--- a/Assignment 4/assignment 4-wordle-2.docx
+++ b/Assignment 4/assignment 4-wordle-2.docx
@@ -1340,36 +1340,23 @@
         </w:rPr>
         <w:t xml:space="preserve">: </w:t>
       </w:r>
-      <w:r>
-        <w:fldChar w:fldCharType="begin"/>
-      </w:r>
-      <w:r>
-        <w:rPr>
-          <w:lang w:val="sv-SE"/>
-        </w:rPr>
-        <w:instrText>HYPERLINK "https://pochat.github.io/harvard-dgmd-e-28/Assignment%204/index.html"</w:instrText>
-      </w:r>
-      <w:r>
-        <w:fldChar w:fldCharType="separate"/>
-      </w:r>
-      <w:r>
-        <w:rPr>
-          <w:rStyle w:val="Hyperlink"/>
-          <w:rFonts w:asciiTheme="minorHAnsi" w:eastAsiaTheme="minorHAnsi" w:hAnsiTheme="minorHAnsi" w:cstheme="minorBidi"/>
-          <w:b w:val="0"/>
-          <w:bCs w:val="0"/>
-          <w:lang w:val="sv-SE"/>
-        </w:rPr>
-        <w:t>https://pochat.github.io/harvard-dgmd-e-28/Assignment%204/index.html</w:t>
-      </w:r>
-      <w:r>
-        <w:fldChar w:fldCharType="end"/>
-      </w:r>
+      <w:hyperlink r:id="rId10" w:history="1">
+        <w:r>
+          <w:rPr>
+            <w:rStyle w:val="Hyperlink"/>
+            <w:rFonts w:asciiTheme="minorHAnsi" w:eastAsiaTheme="minorHAnsi" w:hAnsiTheme="minorHAnsi" w:cstheme="minorBidi"/>
+            <w:b w:val="0"/>
+            <w:bCs w:val="0"/>
+            <w:lang w:val="sv-SE"/>
+          </w:rPr>
+          <w:t>https://pochat.github.io/harvard-dgmd-e-28/Assignment%204/index.html</w:t>
+        </w:r>
+      </w:hyperlink>
     </w:p>
     <w:p>
       <w:r>
         <w:rPr>
-          <w:lang w:val="sv-SE"/>
+          <w:lang w:val="en-CA"/>
         </w:rPr>
         <w:br/>
       </w:r>
@@ -1411,7 +1398,12 @@
       <w:r>
         <w:t xml:space="preserve">Did you complete any extra features? </w:t>
       </w:r>
+    </w:p>
+    <w:p>
       <w:r>
+        <w:rPr>
+          <w:color w:val="0070C0"/>
+        </w:rPr>
         <w:t>Yes, I added the following extra features:</w:t>
       </w:r>
     </w:p>
@@ -1469,8 +1461,31 @@
     </w:p>
     <w:p/>
     <w:p>
+      <w:pPr>
+        <w:rPr>
+          <w:lang w:val="en-CA"/>
+        </w:rPr>
+      </w:pPr>
       <w:r>
-        <w:t>Was there anything you could not get to work?  _________________________________</w:t>
+        <w:t xml:space="preserve">Was there anything you could not get to work?  </w:t>
+      </w:r>
+      <w:r>
+        <w:rPr>
+          <w:color w:val="0070C0"/>
+        </w:rPr>
+        <w:t>I almost g</w:t>
+      </w:r>
+      <w:r>
+        <w:rPr>
+          <w:color w:val="0070C0"/>
+        </w:rPr>
+        <w:t>a</w:t>
+      </w:r>
+      <w:r>
+        <w:rPr>
+          <w:color w:val="0070C0"/>
+        </w:rPr>
+        <w:t>ve up in coloring yellow letters but checking the duplicated characters. It was very difficult for me, but I got it working after four days. Yay!</w:t>
       </w:r>
     </w:p>
     <w:p>
@@ -1481,8 +1496,19 @@
         <w:t>URL</w:t>
       </w:r>
       <w:r>
-        <w:t xml:space="preserve"> to the source) ________________</w:t>
+        <w:t xml:space="preserve"> to the source)</w:t>
       </w:r>
+      <w:r>
+        <w:t xml:space="preserve"> </w:t>
+      </w:r>
+      <w:hyperlink r:id="rId11" w:history="1">
+        <w:r>
+          <w:rPr>
+            <w:rStyle w:val="Hyperlink"/>
+          </w:rPr>
+          <w:t>https://www.datamuse.com/api/</w:t>
+        </w:r>
+      </w:hyperlink>
       <w:r>
         <w:br/>
       </w:r>
@@ -1497,6 +1523,7 @@
     </w:p>
     <w:p>
       <w:r>
+        <w:lastRenderedPageBreak/>
         <w:t>Wh</w:t>
       </w:r>
       <w:r>
@@ -1522,7 +1549,6 @@
         <w:rPr>
           <w:color w:val="0070C0"/>
         </w:rPr>
-        <w:lastRenderedPageBreak/>
         <w:t>The most satisfying part is that I</w:t>
       </w:r>
       <w:r>
@@ -1668,7 +1694,7 @@
       </w:r>
     </w:p>
     <w:sectPr>
-      <w:footerReference w:type="default" r:id="rId10"/>
+      <w:footerReference w:type="default" r:id="rId12"/>
       <w:pgSz w:w="12240" w:h="15840" w:code="1"/>
       <w:pgMar w:top="864" w:right="1008" w:bottom="1152" w:left="1008" w:header="720" w:footer="864" w:gutter="0"/>
       <w:cols w:space="720"/>

</xml_diff>